<commit_message>
Docs: add applicant log in step
</commit_message>
<xml_diff>
--- a/Project_Plan.docx
+++ b/Project_Plan.docx
@@ -37,6 +37,9 @@
     </w:p>
     <w:p>
       <w:r>
+        <w:rPr>
+          <w:noProof/>
+        </w:rPr>
         <w:drawing>
           <wp:inline distT="0" distB="0" distL="0" distR="0" wp14:anchorId="775F8E26" wp14:editId="0D6846BA">
             <wp:extent cx="5733415" cy="3537585"/>
@@ -161,6 +164,9 @@
     </w:p>
     <w:p>
       <w:r>
+        <w:rPr>
+          <w:noProof/>
+        </w:rPr>
         <w:lastRenderedPageBreak/>
         <w:drawing>
           <wp:inline distT="0" distB="0" distL="0" distR="0" wp14:anchorId="68A95B2D" wp14:editId="236D7FE5">
@@ -315,6 +321,9 @@
     </w:p>
     <w:p>
       <w:r>
+        <w:rPr>
+          <w:noProof/>
+        </w:rPr>
         <w:drawing>
           <wp:inline distT="0" distB="0" distL="0" distR="0" wp14:anchorId="16EF8F29" wp14:editId="31683BAB">
             <wp:extent cx="5733415" cy="3171190"/>
@@ -379,33 +388,26 @@
           <w:b/>
           <w:bCs/>
         </w:rPr>
-        <w:t>Job seeker</w:t>
-      </w:r>
-      <w:r>
+        <w:t>Job seeker Flow:</w:t>
+      </w:r>
+    </w:p>
+    <w:p>
+      <w:pPr>
         <w:rPr>
           <w:b/>
           <w:bCs/>
         </w:rPr>
-        <w:t xml:space="preserve"> Flow:</w:t>
-      </w:r>
-    </w:p>
-    <w:p>
-      <w:pPr>
+      </w:pPr>
+      <w:r>
         <w:rPr>
           <w:b/>
           <w:bCs/>
         </w:rPr>
-      </w:pPr>
-      <w:r>
-        <w:rPr>
-          <w:b/>
-          <w:bCs/>
-        </w:rPr>
         <w:drawing>
-          <wp:inline distT="0" distB="0" distL="0" distR="0" wp14:anchorId="36839D76" wp14:editId="37B2735C">
-            <wp:extent cx="5733415" cy="2109470"/>
-            <wp:effectExtent l="0" t="0" r="635" b="5080"/>
-            <wp:docPr id="1209253460" name="Picture 1"/>
+          <wp:inline distT="0" distB="0" distL="0" distR="0" wp14:anchorId="738A5E33" wp14:editId="7CCFD2BB">
+            <wp:extent cx="5733415" cy="2153285"/>
+            <wp:effectExtent l="0" t="0" r="635" b="0"/>
+            <wp:docPr id="1342074741" name="Picture 1"/>
             <wp:cNvGraphicFramePr>
               <a:graphicFrameLocks xmlns:a="http://schemas.openxmlformats.org/drawingml/2006/main" noChangeAspect="1"/>
             </wp:cNvGraphicFramePr>
@@ -413,7 +415,7 @@
               <a:graphicData uri="http://schemas.openxmlformats.org/drawingml/2006/picture">
                 <pic:pic xmlns:pic="http://schemas.openxmlformats.org/drawingml/2006/picture">
                   <pic:nvPicPr>
-                    <pic:cNvPr id="1209253460" name=""/>
+                    <pic:cNvPr id="1342074741" name=""/>
                     <pic:cNvPicPr/>
                   </pic:nvPicPr>
                   <pic:blipFill>
@@ -425,7 +427,7 @@
                   <pic:spPr>
                     <a:xfrm>
                       <a:off x="0" y="0"/>
-                      <a:ext cx="5733415" cy="2109470"/>
+                      <a:ext cx="5733415" cy="2153285"/>
                     </a:xfrm>
                     <a:prstGeom prst="rect">
                       <a:avLst/>
@@ -451,6 +453,24 @@
         <w:rPr>
           <w:rFonts w:ascii="Arial Unicode MS" w:eastAsia="Arial Unicode MS" w:hAnsi="Arial Unicode MS" w:cs="Arial Unicode MS"/>
         </w:rPr>
+        <w:t xml:space="preserve">Log in </w:t>
+      </w:r>
+      <w:r>
+        <w:rPr>
+          <w:rFonts w:ascii="Arial Unicode MS" w:eastAsia="Arial Unicode MS" w:hAnsi="Arial Unicode MS" w:cs="Arial Unicode MS"/>
+        </w:rPr>
+        <w:t>→</w:t>
+      </w:r>
+      <w:r>
+        <w:rPr>
+          <w:rFonts w:ascii="Arial Unicode MS" w:eastAsia="Arial Unicode MS" w:hAnsi="Arial Unicode MS" w:cs="Arial Unicode MS"/>
+        </w:rPr>
+        <w:t xml:space="preserve"> </w:t>
+      </w:r>
+      <w:r>
+        <w:rPr>
+          <w:rFonts w:ascii="Arial Unicode MS" w:eastAsia="Arial Unicode MS" w:hAnsi="Arial Unicode MS" w:cs="Arial Unicode MS"/>
+        </w:rPr>
         <w:t xml:space="preserve">Visit homepage → </w:t>
       </w:r>
       <w:r>
@@ -481,61 +501,19 @@
         <w:rPr>
           <w:rFonts w:ascii="Arial Unicode MS" w:eastAsia="Arial Unicode MS" w:hAnsi="Arial Unicode MS" w:cs="Arial Unicode MS"/>
         </w:rPr>
-        <w:t xml:space="preserve"> Select a posting </w:t>
+        <w:t xml:space="preserve"> Select a posting → Enter personal details → Upload CV </w:t>
       </w:r>
       <w:r>
         <w:rPr>
           <w:rFonts w:ascii="Arial Unicode MS" w:eastAsia="Arial Unicode MS" w:hAnsi="Arial Unicode MS" w:cs="Arial Unicode MS"/>
         </w:rPr>
-        <w:t xml:space="preserve">→ </w:t>
+        <w:t>→ Apply</w:t>
       </w:r>
       <w:r>
         <w:rPr>
           <w:rFonts w:ascii="Arial Unicode MS" w:eastAsia="Arial Unicode MS" w:hAnsi="Arial Unicode MS" w:cs="Arial Unicode MS"/>
         </w:rPr>
-        <w:t xml:space="preserve">Enter personal details </w:t>
-      </w:r>
-      <w:r>
-        <w:rPr>
-          <w:rFonts w:ascii="Arial Unicode MS" w:eastAsia="Arial Unicode MS" w:hAnsi="Arial Unicode MS" w:cs="Arial Unicode MS"/>
-        </w:rPr>
-        <w:t xml:space="preserve">→ </w:t>
-      </w:r>
-      <w:r>
-        <w:rPr>
-          <w:rFonts w:ascii="Arial Unicode MS" w:eastAsia="Arial Unicode MS" w:hAnsi="Arial Unicode MS" w:cs="Arial Unicode MS"/>
-        </w:rPr>
-        <w:t xml:space="preserve">Upload CV </w:t>
-      </w:r>
-      <w:r>
-        <w:rPr>
-          <w:rFonts w:ascii="Arial Unicode MS" w:eastAsia="Arial Unicode MS" w:hAnsi="Arial Unicode MS" w:cs="Arial Unicode MS"/>
-        </w:rPr>
-        <w:t>→</w:t>
-      </w:r>
-      <w:r>
-        <w:rPr>
-          <w:rFonts w:ascii="Arial Unicode MS" w:eastAsia="Arial Unicode MS" w:hAnsi="Arial Unicode MS" w:cs="Arial Unicode MS"/>
-        </w:rPr>
-        <w:t xml:space="preserve"> Apply</w:t>
-      </w:r>
-      <w:r>
-        <w:rPr>
-          <w:rFonts w:ascii="Arial Unicode MS" w:eastAsia="Arial Unicode MS" w:hAnsi="Arial Unicode MS" w:cs="Arial Unicode MS"/>
-        </w:rPr>
-        <w:t xml:space="preserve"> </w:t>
-      </w:r>
-      <w:r>
-        <w:rPr>
-          <w:rFonts w:ascii="Arial Unicode MS" w:eastAsia="Arial Unicode MS" w:hAnsi="Arial Unicode MS" w:cs="Arial Unicode MS"/>
-        </w:rPr>
-        <w:t>→</w:t>
-      </w:r>
-      <w:r>
-        <w:rPr>
-          <w:rFonts w:ascii="Arial Unicode MS" w:eastAsia="Arial Unicode MS" w:hAnsi="Arial Unicode MS" w:cs="Arial Unicode MS"/>
-        </w:rPr>
-        <w:t xml:space="preserve"> Receive confirmation</w:t>
+        <w:t xml:space="preserve"> → Receive confirmation</w:t>
       </w:r>
       <w:r>
         <w:rPr>
@@ -557,6 +535,9 @@
     </w:p>
     <w:p>
       <w:r>
+        <w:rPr>
+          <w:noProof/>
+        </w:rPr>
         <w:drawing>
           <wp:inline distT="0" distB="0" distL="0" distR="0" wp14:anchorId="5416A837" wp14:editId="6C5BAF5B">
             <wp:extent cx="5733415" cy="4897120"/>
@@ -1939,6 +1920,7 @@
   <w:style w:type="character" w:default="1" w:styleId="DefaultParagraphFont">
     <w:name w:val="Default Paragraph Font"/>
     <w:uiPriority w:val="1"/>
+    <w:semiHidden/>
     <w:unhideWhenUsed/>
   </w:style>
   <w:style w:type="table" w:default="1" w:styleId="TableNormal">

</xml_diff>